<commit_message>
feat(agent-05): expand library master knowledge with IP patent procedures and ISI Q1 journals
</commit_message>
<xml_diff>
--- a/subspaces/02-student-services/library-research-agent/agent/knowledge.docx
+++ b/subspaces/02-student-services/library-research-agent/agent/knowledge.docx
@@ -10730,6 +10730,862 @@
                 <w:sz w:val="20"/>
               </w:rPr>
               <w:t>Camera an ninh giám sát 24/7 ghi nhận vi phạm và gửi danh sách về Phòng CTSV để trừ Điểm rèn luyện.</w:t>
+            </w:r>
+          </w:p>
+        </w:tc>
+      </w:tr>
+    </w:tbl>
+    <w:p>
+      <w:pPr>
+        <w:pStyle w:val="Heading1"/>
+        <w:spacing w:before="280" w:after="120"/>
+      </w:pPr>
+      <w:r>
+        <w:rPr>
+          <w:rFonts w:ascii="Times New Roman" w:hAnsi="Times New Roman"/>
+          <w:b/>
+          <w:color w:val="003366"/>
+          <w:sz w:val="28"/>
+        </w:rPr>
+        <w:t>PHẦN 13: CẨM NANG ĐĂNG KÝ BẢN QUYỀN SÁNG CHẾ, GIẢI PHÁP HỮU ÍCH &amp; PHẦN MỀM TẠI TRƯỜNG ĐHKHTN</w:t>
+      </w:r>
+    </w:p>
+    <w:p>
+      <w:pPr>
+        <w:spacing w:after="80" w:line="276" w:lineRule="auto"/>
+      </w:pPr>
+      <w:r>
+        <w:rPr>
+          <w:rFonts w:ascii="Times New Roman" w:hAnsi="Times New Roman"/>
+          <w:sz w:val="22"/>
+        </w:rPr>
+        <w:t>Trường ĐH Khoa học Tự nhiên ĐHQG-HCM luôn khuyến khích sinh viên và giảng viên bảo hộ tài sản trí tuệ phát sinh từ các đề tài nghiên cứu khoa học, khóa luận tốt nghiệp trước khi công bố ra công chúng:</w:t>
+      </w:r>
+    </w:p>
+    <w:p>
+      <w:pPr>
+        <w:pStyle w:val="Heading2"/>
+        <w:spacing w:before="200" w:after="80"/>
+      </w:pPr>
+      <w:r>
+        <w:rPr>
+          <w:rFonts w:ascii="Times New Roman" w:hAnsi="Times New Roman"/>
+          <w:b/>
+          <w:color w:val="1B365D"/>
+          <w:sz w:val="24"/>
+        </w:rPr>
+        <w:t>13.1. Các Đối tượng Sở hữu Trí tuệ Phổ biến của Sinh viên KHTN</w:t>
+      </w:r>
+    </w:p>
+    <w:p>
+      <w:pPr>
+        <w:spacing w:after="80" w:line="276" w:lineRule="auto"/>
+      </w:pPr>
+      <w:r>
+        <w:rPr>
+          <w:rFonts w:ascii="Times New Roman" w:hAnsi="Times New Roman"/>
+          <w:sz w:val="22"/>
+        </w:rPr>
+        <w:t>1. Quyền tác giả đối với Chương trình Máy tính (Phần mềm): Đăng ký Giấy chứng nhận Đăng ký Quyền tác giả tại Cục Bản quyền Tác giả (Bộ VHTTDL). Hồ sơ gồm: Đơn đăng ký, 02 đĩa CD chứa mã nguồn và bộ cài đặt, 02 bản in giao diện và mã nguồn (Code listing).</w:t>
+      </w:r>
+    </w:p>
+    <w:p>
+      <w:pPr>
+        <w:spacing w:after="80" w:line="276" w:lineRule="auto"/>
+      </w:pPr>
+      <w:r>
+        <w:rPr>
+          <w:rFonts w:ascii="Times New Roman" w:hAnsi="Times New Roman"/>
+          <w:sz w:val="22"/>
+        </w:rPr>
+        <w:t>2. Bằng độc quyền Sáng chế &amp; Giải pháp Hữu ích: Bảo hộ các quy trình hóa học mới, công thức vật liệu composite, chủng vi sinh vật biến nạp gen có tính mới và khả năng áp dụng công nghiệp tại Cục Sở hữu Trí tuệ (Bộ KH&amp;CN).</w:t>
+      </w:r>
+    </w:p>
+    <w:p>
+      <w:pPr>
+        <w:spacing w:after="80" w:line="276" w:lineRule="auto"/>
+      </w:pPr>
+      <w:r>
+        <w:rPr>
+          <w:rFonts w:ascii="Times New Roman" w:hAnsi="Times New Roman"/>
+          <w:sz w:val="22"/>
+        </w:rPr>
+        <w:t>3. Bí mật kinh doanh: Các thuật toán độc quyền, công thức thí nghiệm chưa muốn công bố công khai ra bên ngoài.</w:t>
+      </w:r>
+    </w:p>
+    <w:p>
+      <w:pPr>
+        <w:pStyle w:val="Heading2"/>
+        <w:spacing w:before="200" w:after="80"/>
+      </w:pPr>
+      <w:r>
+        <w:rPr>
+          <w:rFonts w:ascii="Times New Roman" w:hAnsi="Times New Roman"/>
+          <w:b/>
+          <w:color w:val="1B365D"/>
+          <w:sz w:val="24"/>
+        </w:rPr>
+        <w:t>13.2. Chính sách Tài trợ Kinh phí Đăng ký Sở hữu Trí tuệ của Nhà trường</w:t>
+      </w:r>
+    </w:p>
+    <w:p>
+      <w:pPr>
+        <w:spacing w:after="80" w:line="276" w:lineRule="auto"/>
+      </w:pPr>
+      <w:r>
+        <w:rPr>
+          <w:rFonts w:ascii="Times New Roman" w:hAnsi="Times New Roman"/>
+          <w:sz w:val="22"/>
+        </w:rPr>
+        <w:t>• Phòng Khoa học - Công nghệ (P.KHCN) HCMUS phối hợp cùng Trung tâm Sở hữu Trí tuệ &amp; Chuyển giao Công nghệ ĐHQG-HCM (IPTC) hỗ trợ 100% kinh phí tra cứu bằng sáng chế, phí nộp đơn và phí duy trì văn bằng bảo hộ cho các nhóm nghiên cứu sinh viên có sản phẩm tiềm năng thương mại hóa.</w:t>
+      </w:r>
+    </w:p>
+    <w:p>
+      <w:pPr>
+        <w:spacing w:after="80" w:line="276" w:lineRule="auto"/>
+      </w:pPr>
+      <w:r>
+        <w:rPr>
+          <w:rFonts w:ascii="Times New Roman" w:hAnsi="Times New Roman"/>
+          <w:sz w:val="22"/>
+        </w:rPr>
+        <w:t>• Địa chỉ liên hệ tư vấn SHTT: Phòng A12, Tòa nhà A - Cơ sở 1 Nguyễn Văn Cừ. Email: shtt@hcmus.edu.vn.</w:t>
+      </w:r>
+    </w:p>
+    <w:p>
+      <w:pPr>
+        <w:pStyle w:val="Heading1"/>
+        <w:spacing w:before="280" w:after="120"/>
+      </w:pPr>
+      <w:r>
+        <w:rPr>
+          <w:rFonts w:ascii="Times New Roman" w:hAnsi="Times New Roman"/>
+          <w:b/>
+          <w:color w:val="003366"/>
+          <w:sz w:val="28"/>
+        </w:rPr>
+        <w:t>PHẦN 14: BẢNG DANH MỤC TẠP CHÍ QUỐC TẾ UY TÍN (ISI/SCOPUS Q1/Q2) THEO LĨNH VỰC</w:t>
+      </w:r>
+    </w:p>
+    <w:p>
+      <w:pPr>
+        <w:spacing w:after="80" w:line="276" w:lineRule="auto"/>
+      </w:pPr>
+      <w:r>
+        <w:rPr>
+          <w:rFonts w:ascii="Times New Roman" w:hAnsi="Times New Roman"/>
+          <w:sz w:val="22"/>
+        </w:rPr>
+        <w:t>Sinh viên làm nghiên cứu khoa học hướng đến công bố quốc tế có thể tra cứu danh sách các tạp chí bình duyệt uy tín được Quỹ NAFOSTED và ĐHQG-HCM công nhận:</w:t>
+      </w:r>
+    </w:p>
+    <w:tbl>
+      <w:tblPr>
+        <w:tblW w:type="auto" w:w="0"/>
+        <w:jc w:val="center"/>
+        <w:tblLook w:firstColumn="1" w:firstRow="1" w:lastColumn="0" w:lastRow="0" w:noHBand="0" w:noVBand="1" w:val="04A0"/>
+      </w:tblPr>
+      <w:tblGrid>
+        <w:gridCol w:w="1728"/>
+        <w:gridCol w:w="1728"/>
+        <w:gridCol w:w="1728"/>
+        <w:gridCol w:w="1728"/>
+        <w:gridCol w:w="1728"/>
+      </w:tblGrid>
+      <w:tr>
+        <w:tc>
+          <w:tcPr>
+            <w:tcW w:type="dxa" w:w="1728"/>
+            <w:shd w:val="clear" w:color="auto" w:fill="003366"/>
+          </w:tcPr>
+          <w:p>
+            <w:r>
+              <w:rPr>
+                <w:rFonts w:ascii="Times New Roman" w:hAnsi="Times New Roman"/>
+                <w:b/>
+                <w:color w:val="FFFFFF"/>
+              </w:rPr>
+              <w:t>Lĩnh Vực Chuyên Ngành</w:t>
+            </w:r>
+          </w:p>
+        </w:tc>
+        <w:tc>
+          <w:tcPr>
+            <w:tcW w:type="dxa" w:w="1728"/>
+            <w:shd w:val="clear" w:color="auto" w:fill="003366"/>
+          </w:tcPr>
+          <w:p>
+            <w:r>
+              <w:rPr>
+                <w:rFonts w:ascii="Times New Roman" w:hAnsi="Times New Roman"/>
+                <w:b/>
+                <w:color w:val="FFFFFF"/>
+              </w:rPr>
+              <w:t>Tên Tạp Chí Quốc Tế</w:t>
+            </w:r>
+          </w:p>
+        </w:tc>
+        <w:tc>
+          <w:tcPr>
+            <w:tcW w:type="dxa" w:w="1728"/>
+            <w:shd w:val="clear" w:color="auto" w:fill="003366"/>
+          </w:tcPr>
+          <w:p>
+            <w:r>
+              <w:rPr>
+                <w:rFonts w:ascii="Times New Roman" w:hAnsi="Times New Roman"/>
+                <w:b/>
+                <w:color w:val="FFFFFF"/>
+              </w:rPr>
+              <w:t>Phân Hạng</w:t>
+            </w:r>
+          </w:p>
+        </w:tc>
+        <w:tc>
+          <w:tcPr>
+            <w:tcW w:type="dxa" w:w="1728"/>
+            <w:shd w:val="clear" w:color="auto" w:fill="003366"/>
+          </w:tcPr>
+          <w:p>
+            <w:r>
+              <w:rPr>
+                <w:rFonts w:ascii="Times New Roman" w:hAnsi="Times New Roman"/>
+                <w:b/>
+                <w:color w:val="FFFFFF"/>
+              </w:rPr>
+              <w:t>Nhà Xuất Bản</w:t>
+            </w:r>
+          </w:p>
+        </w:tc>
+        <w:tc>
+          <w:tcPr>
+            <w:tcW w:type="dxa" w:w="1728"/>
+            <w:shd w:val="clear" w:color="auto" w:fill="003366"/>
+          </w:tcPr>
+          <w:p>
+            <w:r>
+              <w:rPr>
+                <w:rFonts w:ascii="Times New Roman" w:hAnsi="Times New Roman"/>
+                <w:b/>
+                <w:color w:val="FFFFFF"/>
+              </w:rPr>
+              <w:t>Đặc Tả &amp; Mức Độ Ảnh Hưởng (Impact)</w:t>
+            </w:r>
+          </w:p>
+        </w:tc>
+      </w:tr>
+      <w:tr>
+        <w:tc>
+          <w:tcPr>
+            <w:tcW w:type="dxa" w:w="1728"/>
+            <w:shd w:val="clear" w:color="auto" w:fill="F4F6F9"/>
+          </w:tcPr>
+          <w:p>
+            <w:r>
+              <w:rPr>
+                <w:rFonts w:ascii="Times New Roman" w:hAnsi="Times New Roman"/>
+                <w:sz w:val="18"/>
+              </w:rPr>
+              <w:t>Khoa học Máy tính &amp; AI</w:t>
+            </w:r>
+          </w:p>
+        </w:tc>
+        <w:tc>
+          <w:tcPr>
+            <w:tcW w:type="dxa" w:w="1728"/>
+            <w:shd w:val="clear" w:color="auto" w:fill="FFFFFF"/>
+          </w:tcPr>
+          <w:p>
+            <w:r>
+              <w:rPr>
+                <w:rFonts w:ascii="Times New Roman" w:hAnsi="Times New Roman"/>
+                <w:sz w:val="18"/>
+              </w:rPr>
+              <w:t>IEEE Transactions on Pattern Analysis and Machine Intelligence (TPAMI)</w:t>
+            </w:r>
+          </w:p>
+        </w:tc>
+        <w:tc>
+          <w:tcPr>
+            <w:tcW w:type="dxa" w:w="1728"/>
+            <w:shd w:val="clear" w:color="auto" w:fill="FFFFFF"/>
+          </w:tcPr>
+          <w:p>
+            <w:r>
+              <w:rPr>
+                <w:rFonts w:ascii="Times New Roman" w:hAnsi="Times New Roman"/>
+                <w:sz w:val="18"/>
+              </w:rPr>
+              <w:t>Q1</w:t>
+            </w:r>
+          </w:p>
+        </w:tc>
+        <w:tc>
+          <w:tcPr>
+            <w:tcW w:type="dxa" w:w="1728"/>
+            <w:shd w:val="clear" w:color="auto" w:fill="FFFFFF"/>
+          </w:tcPr>
+          <w:p>
+            <w:r>
+              <w:rPr>
+                <w:rFonts w:ascii="Times New Roman" w:hAnsi="Times New Roman"/>
+                <w:sz w:val="18"/>
+              </w:rPr>
+              <w:t>IEEE</w:t>
+            </w:r>
+          </w:p>
+        </w:tc>
+        <w:tc>
+          <w:tcPr>
+            <w:tcW w:type="dxa" w:w="1728"/>
+            <w:shd w:val="clear" w:color="auto" w:fill="FFFFFF"/>
+          </w:tcPr>
+          <w:p>
+            <w:r>
+              <w:rPr>
+                <w:rFonts w:ascii="Times New Roman" w:hAnsi="Times New Roman"/>
+                <w:sz w:val="18"/>
+              </w:rPr>
+              <w:t>Impact Factor: 20.8. Tạp chí hàng đầu thế giới về Thị giác máy tính và Trí tuệ nhân tạo.</w:t>
+            </w:r>
+          </w:p>
+        </w:tc>
+      </w:tr>
+      <w:tr>
+        <w:tc>
+          <w:tcPr>
+            <w:tcW w:type="dxa" w:w="1728"/>
+            <w:shd w:val="clear" w:color="auto" w:fill="F4F6F9"/>
+          </w:tcPr>
+          <w:p>
+            <w:r>
+              <w:rPr>
+                <w:rFonts w:ascii="Times New Roman" w:hAnsi="Times New Roman"/>
+                <w:sz w:val="18"/>
+              </w:rPr>
+              <w:t>Khoa học Máy tính &amp; AI</w:t>
+            </w:r>
+          </w:p>
+        </w:tc>
+        <w:tc>
+          <w:tcPr>
+            <w:tcW w:type="dxa" w:w="1728"/>
+            <w:shd w:val="clear" w:color="auto" w:fill="FFFFFF"/>
+          </w:tcPr>
+          <w:p>
+            <w:r>
+              <w:rPr>
+                <w:rFonts w:ascii="Times New Roman" w:hAnsi="Times New Roman"/>
+                <w:sz w:val="18"/>
+              </w:rPr>
+              <w:t>ACM Computing Surveys (CSUR)</w:t>
+            </w:r>
+          </w:p>
+        </w:tc>
+        <w:tc>
+          <w:tcPr>
+            <w:tcW w:type="dxa" w:w="1728"/>
+            <w:shd w:val="clear" w:color="auto" w:fill="FFFFFF"/>
+          </w:tcPr>
+          <w:p>
+            <w:r>
+              <w:rPr>
+                <w:rFonts w:ascii="Times New Roman" w:hAnsi="Times New Roman"/>
+                <w:sz w:val="18"/>
+              </w:rPr>
+              <w:t>Q1</w:t>
+            </w:r>
+          </w:p>
+        </w:tc>
+        <w:tc>
+          <w:tcPr>
+            <w:tcW w:type="dxa" w:w="1728"/>
+            <w:shd w:val="clear" w:color="auto" w:fill="FFFFFF"/>
+          </w:tcPr>
+          <w:p>
+            <w:r>
+              <w:rPr>
+                <w:rFonts w:ascii="Times New Roman" w:hAnsi="Times New Roman"/>
+                <w:sz w:val="18"/>
+              </w:rPr>
+              <w:t>ACM</w:t>
+            </w:r>
+          </w:p>
+        </w:tc>
+        <w:tc>
+          <w:tcPr>
+            <w:tcW w:type="dxa" w:w="1728"/>
+            <w:shd w:val="clear" w:color="auto" w:fill="FFFFFF"/>
+          </w:tcPr>
+          <w:p>
+            <w:r>
+              <w:rPr>
+                <w:rFonts w:ascii="Times New Roman" w:hAnsi="Times New Roman"/>
+                <w:sz w:val="18"/>
+              </w:rPr>
+              <w:t>Impact Factor: 16.6. Khảo sát toàn diện các hướng nghiên cứu thuật toán tiên tiến.</w:t>
+            </w:r>
+          </w:p>
+        </w:tc>
+      </w:tr>
+      <w:tr>
+        <w:tc>
+          <w:tcPr>
+            <w:tcW w:type="dxa" w:w="1728"/>
+            <w:shd w:val="clear" w:color="auto" w:fill="F4F6F9"/>
+          </w:tcPr>
+          <w:p>
+            <w:r>
+              <w:rPr>
+                <w:rFonts w:ascii="Times New Roman" w:hAnsi="Times New Roman"/>
+                <w:sz w:val="18"/>
+              </w:rPr>
+              <w:t>Toán học Lý thuyết &amp; Ứng dụng</w:t>
+            </w:r>
+          </w:p>
+        </w:tc>
+        <w:tc>
+          <w:tcPr>
+            <w:tcW w:type="dxa" w:w="1728"/>
+            <w:shd w:val="clear" w:color="auto" w:fill="FFFFFF"/>
+          </w:tcPr>
+          <w:p>
+            <w:r>
+              <w:rPr>
+                <w:rFonts w:ascii="Times New Roman" w:hAnsi="Times New Roman"/>
+                <w:sz w:val="18"/>
+              </w:rPr>
+              <w:t>Journal of Differential Equations</w:t>
+            </w:r>
+          </w:p>
+        </w:tc>
+        <w:tc>
+          <w:tcPr>
+            <w:tcW w:type="dxa" w:w="1728"/>
+            <w:shd w:val="clear" w:color="auto" w:fill="FFFFFF"/>
+          </w:tcPr>
+          <w:p>
+            <w:r>
+              <w:rPr>
+                <w:rFonts w:ascii="Times New Roman" w:hAnsi="Times New Roman"/>
+                <w:sz w:val="18"/>
+              </w:rPr>
+              <w:t>Q1</w:t>
+            </w:r>
+          </w:p>
+        </w:tc>
+        <w:tc>
+          <w:tcPr>
+            <w:tcW w:type="dxa" w:w="1728"/>
+            <w:shd w:val="clear" w:color="auto" w:fill="FFFFFF"/>
+          </w:tcPr>
+          <w:p>
+            <w:r>
+              <w:rPr>
+                <w:rFonts w:ascii="Times New Roman" w:hAnsi="Times New Roman"/>
+                <w:sz w:val="18"/>
+              </w:rPr>
+              <w:t>Elsevier</w:t>
+            </w:r>
+          </w:p>
+        </w:tc>
+        <w:tc>
+          <w:tcPr>
+            <w:tcW w:type="dxa" w:w="1728"/>
+            <w:shd w:val="clear" w:color="auto" w:fill="FFFFFF"/>
+          </w:tcPr>
+          <w:p>
+            <w:r>
+              <w:rPr>
+                <w:rFonts w:ascii="Times New Roman" w:hAnsi="Times New Roman"/>
+                <w:sz w:val="18"/>
+              </w:rPr>
+              <w:t>Tạp chí chuẩn mực về phương trình vi phân và giải tích ứng dụng.</w:t>
+            </w:r>
+          </w:p>
+        </w:tc>
+      </w:tr>
+      <w:tr>
+        <w:tc>
+          <w:tcPr>
+            <w:tcW w:type="dxa" w:w="1728"/>
+            <w:shd w:val="clear" w:color="auto" w:fill="F4F6F9"/>
+          </w:tcPr>
+          <w:p>
+            <w:r>
+              <w:rPr>
+                <w:rFonts w:ascii="Times New Roman" w:hAnsi="Times New Roman"/>
+                <w:sz w:val="18"/>
+              </w:rPr>
+              <w:t>Vật lý &amp; Khoa học Vật liệu</w:t>
+            </w:r>
+          </w:p>
+        </w:tc>
+        <w:tc>
+          <w:tcPr>
+            <w:tcW w:type="dxa" w:w="1728"/>
+            <w:shd w:val="clear" w:color="auto" w:fill="FFFFFF"/>
+          </w:tcPr>
+          <w:p>
+            <w:r>
+              <w:rPr>
+                <w:rFonts w:ascii="Times New Roman" w:hAnsi="Times New Roman"/>
+                <w:sz w:val="18"/>
+              </w:rPr>
+              <w:t>Physical Review Letters (PRL)</w:t>
+            </w:r>
+          </w:p>
+        </w:tc>
+        <w:tc>
+          <w:tcPr>
+            <w:tcW w:type="dxa" w:w="1728"/>
+            <w:shd w:val="clear" w:color="auto" w:fill="FFFFFF"/>
+          </w:tcPr>
+          <w:p>
+            <w:r>
+              <w:rPr>
+                <w:rFonts w:ascii="Times New Roman" w:hAnsi="Times New Roman"/>
+                <w:sz w:val="18"/>
+              </w:rPr>
+              <w:t>Q1</w:t>
+            </w:r>
+          </w:p>
+        </w:tc>
+        <w:tc>
+          <w:tcPr>
+            <w:tcW w:type="dxa" w:w="1728"/>
+            <w:shd w:val="clear" w:color="auto" w:fill="FFFFFF"/>
+          </w:tcPr>
+          <w:p>
+            <w:r>
+              <w:rPr>
+                <w:rFonts w:ascii="Times New Roman" w:hAnsi="Times New Roman"/>
+                <w:sz w:val="18"/>
+              </w:rPr>
+              <w:t>APS</w:t>
+            </w:r>
+          </w:p>
+        </w:tc>
+        <w:tc>
+          <w:tcPr>
+            <w:tcW w:type="dxa" w:w="1728"/>
+            <w:shd w:val="clear" w:color="auto" w:fill="FFFFFF"/>
+          </w:tcPr>
+          <w:p>
+            <w:r>
+              <w:rPr>
+                <w:rFonts w:ascii="Times New Roman" w:hAnsi="Times New Roman"/>
+                <w:sz w:val="18"/>
+              </w:rPr>
+              <w:t>Tạp chí đỉnh cao của Hội Vật lý Hoa Kỳ về các khám phá vật lý lượng tử.</w:t>
+            </w:r>
+          </w:p>
+        </w:tc>
+      </w:tr>
+      <w:tr>
+        <w:tc>
+          <w:tcPr>
+            <w:tcW w:type="dxa" w:w="1728"/>
+            <w:shd w:val="clear" w:color="auto" w:fill="F4F6F9"/>
+          </w:tcPr>
+          <w:p>
+            <w:r>
+              <w:rPr>
+                <w:rFonts w:ascii="Times New Roman" w:hAnsi="Times New Roman"/>
+                <w:sz w:val="18"/>
+              </w:rPr>
+              <w:t>Vật lý &amp; Khoa học Vật liệu</w:t>
+            </w:r>
+          </w:p>
+        </w:tc>
+        <w:tc>
+          <w:tcPr>
+            <w:tcW w:type="dxa" w:w="1728"/>
+            <w:shd w:val="clear" w:color="auto" w:fill="FFFFFF"/>
+          </w:tcPr>
+          <w:p>
+            <w:r>
+              <w:rPr>
+                <w:rFonts w:ascii="Times New Roman" w:hAnsi="Times New Roman"/>
+                <w:sz w:val="18"/>
+              </w:rPr>
+              <w:t>Applied Surface Science</w:t>
+            </w:r>
+          </w:p>
+        </w:tc>
+        <w:tc>
+          <w:tcPr>
+            <w:tcW w:type="dxa" w:w="1728"/>
+            <w:shd w:val="clear" w:color="auto" w:fill="FFFFFF"/>
+          </w:tcPr>
+          <w:p>
+            <w:r>
+              <w:rPr>
+                <w:rFonts w:ascii="Times New Roman" w:hAnsi="Times New Roman"/>
+                <w:sz w:val="18"/>
+              </w:rPr>
+              <w:t>Q1</w:t>
+            </w:r>
+          </w:p>
+        </w:tc>
+        <w:tc>
+          <w:tcPr>
+            <w:tcW w:type="dxa" w:w="1728"/>
+            <w:shd w:val="clear" w:color="auto" w:fill="FFFFFF"/>
+          </w:tcPr>
+          <w:p>
+            <w:r>
+              <w:rPr>
+                <w:rFonts w:ascii="Times New Roman" w:hAnsi="Times New Roman"/>
+                <w:sz w:val="18"/>
+              </w:rPr>
+              <w:t>Elsevier</w:t>
+            </w:r>
+          </w:p>
+        </w:tc>
+        <w:tc>
+          <w:tcPr>
+            <w:tcW w:type="dxa" w:w="1728"/>
+            <w:shd w:val="clear" w:color="auto" w:fill="FFFFFF"/>
+          </w:tcPr>
+          <w:p>
+            <w:r>
+              <w:rPr>
+                <w:rFonts w:ascii="Times New Roman" w:hAnsi="Times New Roman"/>
+                <w:sz w:val="18"/>
+              </w:rPr>
+              <w:t>Chuyên ngành vật liệu nano, màng mỏng bán dẫn và xúc tác quang hóa.</w:t>
+            </w:r>
+          </w:p>
+        </w:tc>
+      </w:tr>
+      <w:tr>
+        <w:tc>
+          <w:tcPr>
+            <w:tcW w:type="dxa" w:w="1728"/>
+            <w:shd w:val="clear" w:color="auto" w:fill="F4F6F9"/>
+          </w:tcPr>
+          <w:p>
+            <w:r>
+              <w:rPr>
+                <w:rFonts w:ascii="Times New Roman" w:hAnsi="Times New Roman"/>
+                <w:sz w:val="18"/>
+              </w:rPr>
+              <w:t>Hóa học &amp; Hóa dược</w:t>
+            </w:r>
+          </w:p>
+        </w:tc>
+        <w:tc>
+          <w:tcPr>
+            <w:tcW w:type="dxa" w:w="1728"/>
+            <w:shd w:val="clear" w:color="auto" w:fill="FFFFFF"/>
+          </w:tcPr>
+          <w:p>
+            <w:r>
+              <w:rPr>
+                <w:rFonts w:ascii="Times New Roman" w:hAnsi="Times New Roman"/>
+                <w:sz w:val="18"/>
+              </w:rPr>
+              <w:t>Journal of the American Chemical Society (JACS)</w:t>
+            </w:r>
+          </w:p>
+        </w:tc>
+        <w:tc>
+          <w:tcPr>
+            <w:tcW w:type="dxa" w:w="1728"/>
+            <w:shd w:val="clear" w:color="auto" w:fill="FFFFFF"/>
+          </w:tcPr>
+          <w:p>
+            <w:r>
+              <w:rPr>
+                <w:rFonts w:ascii="Times New Roman" w:hAnsi="Times New Roman"/>
+                <w:sz w:val="18"/>
+              </w:rPr>
+              <w:t>Q1</w:t>
+            </w:r>
+          </w:p>
+        </w:tc>
+        <w:tc>
+          <w:tcPr>
+            <w:tcW w:type="dxa" w:w="1728"/>
+            <w:shd w:val="clear" w:color="auto" w:fill="FFFFFF"/>
+          </w:tcPr>
+          <w:p>
+            <w:r>
+              <w:rPr>
+                <w:rFonts w:ascii="Times New Roman" w:hAnsi="Times New Roman"/>
+                <w:sz w:val="18"/>
+              </w:rPr>
+              <w:t>ACS</w:t>
+            </w:r>
+          </w:p>
+        </w:tc>
+        <w:tc>
+          <w:tcPr>
+            <w:tcW w:type="dxa" w:w="1728"/>
+            <w:shd w:val="clear" w:color="auto" w:fill="FFFFFF"/>
+          </w:tcPr>
+          <w:p>
+            <w:r>
+              <w:rPr>
+                <w:rFonts w:ascii="Times New Roman" w:hAnsi="Times New Roman"/>
+                <w:sz w:val="18"/>
+              </w:rPr>
+              <w:t>Impact Factor: 15.0. Công bố các đột phá tổng hợp hữu cơ và vật liệu mới.</w:t>
+            </w:r>
+          </w:p>
+        </w:tc>
+      </w:tr>
+      <w:tr>
+        <w:tc>
+          <w:tcPr>
+            <w:tcW w:type="dxa" w:w="1728"/>
+            <w:shd w:val="clear" w:color="auto" w:fill="F4F6F9"/>
+          </w:tcPr>
+          <w:p>
+            <w:r>
+              <w:rPr>
+                <w:rFonts w:ascii="Times New Roman" w:hAnsi="Times New Roman"/>
+                <w:sz w:val="18"/>
+              </w:rPr>
+              <w:t>Sinh học &amp; CNSH</w:t>
+            </w:r>
+          </w:p>
+        </w:tc>
+        <w:tc>
+          <w:tcPr>
+            <w:tcW w:type="dxa" w:w="1728"/>
+            <w:shd w:val="clear" w:color="auto" w:fill="FFFFFF"/>
+          </w:tcPr>
+          <w:p>
+            <w:r>
+              <w:rPr>
+                <w:rFonts w:ascii="Times New Roman" w:hAnsi="Times New Roman"/>
+                <w:sz w:val="18"/>
+              </w:rPr>
+              <w:t>Nature Communications</w:t>
+            </w:r>
+          </w:p>
+        </w:tc>
+        <w:tc>
+          <w:tcPr>
+            <w:tcW w:type="dxa" w:w="1728"/>
+            <w:shd w:val="clear" w:color="auto" w:fill="FFFFFF"/>
+          </w:tcPr>
+          <w:p>
+            <w:r>
+              <w:rPr>
+                <w:rFonts w:ascii="Times New Roman" w:hAnsi="Times New Roman"/>
+                <w:sz w:val="18"/>
+              </w:rPr>
+              <w:t>Q1</w:t>
+            </w:r>
+          </w:p>
+        </w:tc>
+        <w:tc>
+          <w:tcPr>
+            <w:tcW w:type="dxa" w:w="1728"/>
+            <w:shd w:val="clear" w:color="auto" w:fill="FFFFFF"/>
+          </w:tcPr>
+          <w:p>
+            <w:r>
+              <w:rPr>
+                <w:rFonts w:ascii="Times New Roman" w:hAnsi="Times New Roman"/>
+                <w:sz w:val="18"/>
+              </w:rPr>
+              <w:t>Nature Portfolio</w:t>
+            </w:r>
+          </w:p>
+        </w:tc>
+        <w:tc>
+          <w:tcPr>
+            <w:tcW w:type="dxa" w:w="1728"/>
+            <w:shd w:val="clear" w:color="auto" w:fill="FFFFFF"/>
+          </w:tcPr>
+          <w:p>
+            <w:r>
+              <w:rPr>
+                <w:rFonts w:ascii="Times New Roman" w:hAnsi="Times New Roman"/>
+                <w:sz w:val="18"/>
+              </w:rPr>
+              <w:t>Tạp chí đa ngành mở công bố các công trình sinh học phân tử và y sinh học.</w:t>
+            </w:r>
+          </w:p>
+        </w:tc>
+      </w:tr>
+      <w:tr>
+        <w:tc>
+          <w:tcPr>
+            <w:tcW w:type="dxa" w:w="1728"/>
+            <w:shd w:val="clear" w:color="auto" w:fill="F4F6F9"/>
+          </w:tcPr>
+          <w:p>
+            <w:r>
+              <w:rPr>
+                <w:rFonts w:ascii="Times New Roman" w:hAnsi="Times New Roman"/>
+                <w:sz w:val="18"/>
+              </w:rPr>
+              <w:t>Môi trường &amp; Biến đổi khí hậu</w:t>
+            </w:r>
+          </w:p>
+        </w:tc>
+        <w:tc>
+          <w:tcPr>
+            <w:tcW w:type="dxa" w:w="1728"/>
+            <w:shd w:val="clear" w:color="auto" w:fill="FFFFFF"/>
+          </w:tcPr>
+          <w:p>
+            <w:r>
+              <w:rPr>
+                <w:rFonts w:ascii="Times New Roman" w:hAnsi="Times New Roman"/>
+                <w:sz w:val="18"/>
+              </w:rPr>
+              <w:t>Science of The Total Environment</w:t>
+            </w:r>
+          </w:p>
+        </w:tc>
+        <w:tc>
+          <w:tcPr>
+            <w:tcW w:type="dxa" w:w="1728"/>
+            <w:shd w:val="clear" w:color="auto" w:fill="FFFFFF"/>
+          </w:tcPr>
+          <w:p>
+            <w:r>
+              <w:rPr>
+                <w:rFonts w:ascii="Times New Roman" w:hAnsi="Times New Roman"/>
+                <w:sz w:val="18"/>
+              </w:rPr>
+              <w:t>Q1</w:t>
+            </w:r>
+          </w:p>
+        </w:tc>
+        <w:tc>
+          <w:tcPr>
+            <w:tcW w:type="dxa" w:w="1728"/>
+            <w:shd w:val="clear" w:color="auto" w:fill="FFFFFF"/>
+          </w:tcPr>
+          <w:p>
+            <w:r>
+              <w:rPr>
+                <w:rFonts w:ascii="Times New Roman" w:hAnsi="Times New Roman"/>
+                <w:sz w:val="18"/>
+              </w:rPr>
+              <w:t>Elsevier</w:t>
+            </w:r>
+          </w:p>
+        </w:tc>
+        <w:tc>
+          <w:tcPr>
+            <w:tcW w:type="dxa" w:w="1728"/>
+            <w:shd w:val="clear" w:color="auto" w:fill="FFFFFF"/>
+          </w:tcPr>
+          <w:p>
+            <w:r>
+              <w:rPr>
+                <w:rFonts w:ascii="Times New Roman" w:hAnsi="Times New Roman"/>
+                <w:sz w:val="18"/>
+              </w:rPr>
+              <w:t>Nghiên cứu ô nhiễm không khí, kim loại nặng và quản lý tài nguyên nước.</w:t>
             </w:r>
           </w:p>
         </w:tc>

</xml_diff>